<commit_message>
Completion of the Study Case No. 2 & 3
</commit_message>
<xml_diff>
--- a/works/CS2-MER_Farmaseutica_Liga_LimboSD.docx
+++ b/works/CS2-MER_Farmaseutica_Liga_LimboSD.docx
@@ -64,12 +64,12 @@
             <wp:extent cx="876300" cy="876300"/>
             <wp:effectExtent b="12700" l="12700" r="12700" t="12700"/>
             <wp:wrapNone/>
-            <wp:docPr id="3" name="image1.png"/>
+            <wp:docPr id="3" name="image3.png"/>
             <a:graphic>
               <a:graphicData uri="http://schemas.openxmlformats.org/drawingml/2006/picture">
                 <pic:pic>
                   <pic:nvPicPr>
-                    <pic:cNvPr id="0" name="image1.png"/>
+                    <pic:cNvPr id="0" name="image3.png"/>
                     <pic:cNvPicPr preferRelativeResize="0"/>
                   </pic:nvPicPr>
                   <pic:blipFill>
@@ -110,7 +110,7 @@
         <w:rPr>
           <w:rtl w:val="0"/>
         </w:rPr>
-        <w:t xml:space="preserve">Casos de estudio 2</w:t>
+        <w:t xml:space="preserve">Casos de Estudio 2</w:t>
       </w:r>
       <w:r>
         <w:rPr>
@@ -798,7 +798,7 @@
     </w:p>
     <w:sdt>
       <w:sdtPr>
-        <w:id w:val="-1883949419"/>
+        <w:id w:val="443588965"/>
         <w:docPartObj>
           <w:docPartGallery w:val="Table of Contents"/>
           <w:docPartUnique w:val="1"/>
@@ -1169,7 +1169,7 @@
     </w:p>
     <w:sdt>
       <w:sdtPr>
-        <w:id w:val="-1605741138"/>
+        <w:id w:val="-18454903"/>
         <w:docPartObj>
           <w:docPartGallery w:val="Table of Contents"/>
           <w:docPartUnique w:val="1"/>
@@ -1566,12 +1566,12 @@
           <wp:inline distB="114300" distT="114300" distL="114300" distR="114300">
             <wp:extent cx="6126480" cy="5054600"/>
             <wp:effectExtent b="0" l="0" r="0" t="0"/>
-            <wp:docPr id="2" name="image3.png"/>
+            <wp:docPr id="2" name="image1.png"/>
             <a:graphic>
               <a:graphicData uri="http://schemas.openxmlformats.org/drawingml/2006/picture">
                 <pic:pic>
                   <pic:nvPicPr>
-                    <pic:cNvPr id="0" name="image3.png"/>
+                    <pic:cNvPr id="0" name="image1.png"/>
                     <pic:cNvPicPr preferRelativeResize="0"/>
                   </pic:nvPicPr>
                   <pic:blipFill>
@@ -1803,7 +1803,7 @@
         <w:rPr/>
         <w:drawing>
           <wp:inline distB="114300" distT="114300" distL="114300" distR="114300">
-            <wp:extent cx="6126480" cy="6946900"/>
+            <wp:extent cx="6126480" cy="5372100"/>
             <wp:effectExtent b="0" l="0" r="0" t="0"/>
             <wp:docPr id="1" name="image2.png"/>
             <a:graphic>
@@ -1823,7 +1823,7 @@
                   <pic:spPr>
                     <a:xfrm>
                       <a:off x="0" y="0"/>
-                      <a:ext cx="6126480" cy="6946900"/>
+                      <a:ext cx="6126480" cy="5372100"/>
                     </a:xfrm>
                     <a:prstGeom prst="rect"/>
                     <a:ln/>

</xml_diff>